<commit_message>
config enhancements + bugfix
</commit_message>
<xml_diff>
--- a/Java/lab1/lab1_report.docx
+++ b/Java/lab1/lab1_report.docx
@@ -409,23 +409,13 @@
         </w:rPr>
         <w:t>C</w:t>
       </w:r>
-      <w:proofErr w:type="spellStart"/>
-      <w:r>
-        <w:rPr>
-          <w:rFonts w:ascii="Times New Roman" w:hAnsi="Times New Roman" w:cs="Times New Roman"/>
-          <w:sz w:val="28"/>
-          <w:szCs w:val="28"/>
-        </w:rPr>
-        <w:t>тудент</w:t>
-      </w:r>
-      <w:proofErr w:type="spellEnd"/>
-      <w:r>
-        <w:rPr>
-          <w:rFonts w:ascii="Times New Roman" w:hAnsi="Times New Roman" w:cs="Times New Roman"/>
-          <w:sz w:val="28"/>
-          <w:szCs w:val="28"/>
-        </w:rPr>
-        <w:t xml:space="preserve"> гр. 5130902/40002                                                         Лопатин А.В.</w:t>
+      <w:r>
+        <w:rPr>
+          <w:rFonts w:ascii="Times New Roman" w:hAnsi="Times New Roman" w:cs="Times New Roman"/>
+          <w:sz w:val="28"/>
+          <w:szCs w:val="28"/>
+        </w:rPr>
+        <w:t>тудент гр. 5130902/40002                                                         Лопатин А.В.</w:t>
       </w:r>
     </w:p>
     <w:p>
@@ -711,25 +701,7 @@
           <w:sz w:val="28"/>
           <w:szCs w:val="28"/>
         </w:rPr>
-        <w:t xml:space="preserve">Предварительный вариант программы является </w:t>
-      </w:r>
-      <w:proofErr w:type="spellStart"/>
-      <w:r>
-        <w:rPr>
-          <w:rFonts w:ascii="Times New Roman" w:hAnsi="Times New Roman" w:cs="Times New Roman"/>
-          <w:sz w:val="28"/>
-          <w:szCs w:val="28"/>
-        </w:rPr>
-        <w:t>консольнам</w:t>
-      </w:r>
-      <w:proofErr w:type="spellEnd"/>
-      <w:r>
-        <w:rPr>
-          <w:rFonts w:ascii="Times New Roman" w:hAnsi="Times New Roman" w:cs="Times New Roman"/>
-          <w:sz w:val="28"/>
-          <w:szCs w:val="28"/>
-        </w:rPr>
-        <w:t xml:space="preserve"> приложением.</w:t>
+        <w:t>Предварительный вариант программы является консольнам приложением.</w:t>
       </w:r>
     </w:p>
     <w:p>
@@ -750,25 +722,7 @@
           <w:sz w:val="28"/>
           <w:szCs w:val="28"/>
         </w:rPr>
-        <w:t xml:space="preserve">Окончательный вариант программы </w:t>
-      </w:r>
-      <w:proofErr w:type="spellStart"/>
-      <w:r>
-        <w:rPr>
-          <w:rFonts w:ascii="Times New Roman" w:hAnsi="Times New Roman" w:cs="Times New Roman"/>
-          <w:sz w:val="28"/>
-          <w:szCs w:val="28"/>
-        </w:rPr>
-        <w:t>яляется</w:t>
-      </w:r>
-      <w:proofErr w:type="spellEnd"/>
-      <w:r>
-        <w:rPr>
-          <w:rFonts w:ascii="Times New Roman" w:hAnsi="Times New Roman" w:cs="Times New Roman"/>
-          <w:sz w:val="28"/>
-          <w:szCs w:val="28"/>
-        </w:rPr>
-        <w:t xml:space="preserve"> оконным приложением.</w:t>
+        <w:t>Окончательный вариант программы яляется оконным приложением.</w:t>
       </w:r>
     </w:p>
     <w:p>
@@ -1184,7 +1138,7 @@
           <w:noProof/>
         </w:rPr>
         <w:drawing>
-          <wp:inline distT="0" distB="0" distL="0" distR="0" wp14:anchorId="27262D12" wp14:editId="52352570">
+          <wp:inline distT="0" distB="0" distL="0" distR="0" wp14:anchorId="27262D12" wp14:editId="4CEE941C">
             <wp:extent cx="5940425" cy="5913755"/>
             <wp:effectExtent l="0" t="0" r="3175" b="0"/>
             <wp:docPr id="1709773549" name="Рисунок 1"/>
@@ -1462,32 +1416,6 @@
     </w:p>
     <w:p>
       <w:pPr>
-        <w:pStyle w:val="Standard"/>
-        <w:spacing w:after="0" w:line="360" w:lineRule="auto"/>
-        <w:jc w:val="center"/>
-        <w:rPr>
-          <w:rFonts w:ascii="Times New Roman" w:hAnsi="Times New Roman" w:cs="Times New Roman"/>
-          <w:b/>
-          <w:sz w:val="28"/>
-          <w:szCs w:val="28"/>
-        </w:rPr>
-      </w:pPr>
-    </w:p>
-    <w:p>
-      <w:pPr>
-        <w:pStyle w:val="Standard"/>
-        <w:spacing w:after="0" w:line="360" w:lineRule="auto"/>
-        <w:jc w:val="center"/>
-        <w:rPr>
-          <w:rFonts w:ascii="Times New Roman" w:hAnsi="Times New Roman" w:cs="Times New Roman"/>
-          <w:b/>
-          <w:sz w:val="28"/>
-          <w:szCs w:val="28"/>
-        </w:rPr>
-      </w:pPr>
-    </w:p>
-    <w:p>
-      <w:pPr>
         <w:pStyle w:val="10"/>
         <w:numPr>
           <w:ilvl w:val="0"/>
@@ -1498,37 +1426,6 @@
           <w:lang w:val="ru-RU"/>
         </w:rPr>
       </w:pPr>
-      <w:r>
-        <w:rPr>
-          <w:lang w:val="ru-RU"/>
-        </w:rPr>
-        <w:t xml:space="preserve">Рисунок </w:t>
-      </w:r>
-      <w:r>
-        <w:rPr>
-          <w:lang w:val="ru-RU"/>
-        </w:rPr>
-        <w:t>1</w:t>
-      </w:r>
-      <w:r>
-        <w:rPr>
-          <w:lang w:val="ru-RU"/>
-        </w:rPr>
-        <w:t xml:space="preserve"> – </w:t>
-      </w:r>
-      <w:r>
-        <w:rPr>
-          <w:lang w:val="ru-RU"/>
-        </w:rPr>
-        <w:t>Реализация ромбовидного наследования</w:t>
-      </w:r>
-      <w:r>
-        <w:rPr>
-          <w:lang w:val="ru-RU"/>
-        </w:rPr>
-        <w:br/>
-        <w:t>для классов скидок</w:t>
-      </w:r>
     </w:p>
     <w:p>
       <w:pPr>
@@ -1542,6 +1439,46 @@
           <w:lang w:val="ru-RU"/>
         </w:rPr>
       </w:pPr>
+      <w:r>
+        <w:rPr>
+          <w:lang w:val="ru-RU"/>
+        </w:rPr>
+        <w:drawing>
+          <wp:inline distT="0" distB="0" distL="0" distR="0" wp14:anchorId="2541B95D" wp14:editId="04679CDF">
+            <wp:extent cx="5243512" cy="3681949"/>
+            <wp:effectExtent l="0" t="0" r="0" b="0"/>
+            <wp:docPr id="1172893317" name="Рисунок 1"/>
+            <wp:cNvGraphicFramePr>
+              <a:graphicFrameLocks xmlns:a="http://schemas.openxmlformats.org/drawingml/2006/main" noChangeAspect="1"/>
+            </wp:cNvGraphicFramePr>
+            <a:graphic xmlns:a="http://schemas.openxmlformats.org/drawingml/2006/main">
+              <a:graphicData uri="http://schemas.openxmlformats.org/drawingml/2006/picture">
+                <pic:pic xmlns:pic="http://schemas.openxmlformats.org/drawingml/2006/picture">
+                  <pic:nvPicPr>
+                    <pic:cNvPr id="1172893317" name=""/>
+                    <pic:cNvPicPr/>
+                  </pic:nvPicPr>
+                  <pic:blipFill>
+                    <a:blip r:embed="rId14"/>
+                    <a:stretch>
+                      <a:fillRect/>
+                    </a:stretch>
+                  </pic:blipFill>
+                  <pic:spPr>
+                    <a:xfrm>
+                      <a:off x="0" y="0"/>
+                      <a:ext cx="5250299" cy="3686715"/>
+                    </a:xfrm>
+                    <a:prstGeom prst="rect">
+                      <a:avLst/>
+                    </a:prstGeom>
+                  </pic:spPr>
+                </pic:pic>
+              </a:graphicData>
+            </a:graphic>
+          </wp:inline>
+        </w:drawing>
+      </w:r>
     </w:p>
     <w:p>
       <w:pPr>
@@ -1555,6 +1492,43 @@
           <w:lang w:val="ru-RU"/>
         </w:rPr>
       </w:pPr>
+      <w:r>
+        <w:rPr>
+          <w:lang w:val="ru-RU"/>
+        </w:rPr>
+        <w:t xml:space="preserve">Рисунок </w:t>
+      </w:r>
+      <w:r>
+        <w:rPr>
+          <w:lang w:val="ru-RU"/>
+        </w:rPr>
+        <w:t>1</w:t>
+      </w:r>
+      <w:r>
+        <w:rPr>
+          <w:lang w:val="ru-RU"/>
+        </w:rPr>
+        <w:t xml:space="preserve"> –</w:t>
+      </w:r>
+      <w:r>
+        <w:rPr>
+          <w:lang w:val="ru-RU"/>
+        </w:rPr>
+        <w:t xml:space="preserve"> </w:t>
+      </w:r>
+      <w:r>
+        <w:rPr>
+          <w:lang w:val="ru-RU"/>
+        </w:rPr>
+        <w:t>Вырождение системы вследствие поедания</w:t>
+      </w:r>
+      <w:r>
+        <w:rPr>
+          <w:lang w:val="ru-RU"/>
+        </w:rPr>
+        <w:br/>
+        <w:t>травоядными всех растений</w:t>
+      </w:r>
     </w:p>
     <w:p>
       <w:pPr>
@@ -1568,71 +1542,6 @@
           <w:lang w:val="ru-RU"/>
         </w:rPr>
       </w:pPr>
-      <w:r>
-        <w:rPr>
-          <w:lang w:val="ru-RU"/>
-        </w:rPr>
-        <w:t xml:space="preserve">Рисунок </w:t>
-      </w:r>
-      <w:r>
-        <w:rPr>
-          <w:lang w:val="ru-RU"/>
-        </w:rPr>
-        <w:t>2</w:t>
-      </w:r>
-      <w:r>
-        <w:rPr>
-          <w:lang w:val="ru-RU"/>
-        </w:rPr>
-        <w:t xml:space="preserve"> –</w:t>
-      </w:r>
-      <w:r>
-        <w:rPr>
-          <w:lang w:val="ru-RU"/>
-        </w:rPr>
-        <w:t>П</w:t>
-      </w:r>
-      <w:r>
-        <w:rPr>
-          <w:lang w:val="ru-RU"/>
-        </w:rPr>
-        <w:t>ереопределени</w:t>
-      </w:r>
-      <w:r>
-        <w:rPr>
-          <w:lang w:val="ru-RU"/>
-        </w:rPr>
-        <w:t>е</w:t>
-      </w:r>
-      <w:r>
-        <w:rPr>
-          <w:lang w:val="ru-RU"/>
-        </w:rPr>
-        <w:t xml:space="preserve"> оператора </w:t>
-      </w:r>
-      <w:r>
-        <w:rPr>
-          <w:lang w:val="ru-RU"/>
-        </w:rPr>
-        <w:t>индексирования</w:t>
-      </w:r>
-      <w:r>
-        <w:rPr>
-          <w:lang w:val="ru-RU"/>
-        </w:rPr>
-        <w:br/>
-      </w:r>
-      <w:r>
-        <w:rPr>
-          <w:lang w:val="ru-RU"/>
-        </w:rPr>
-        <w:t xml:space="preserve">для класса </w:t>
-      </w:r>
-      <w:proofErr w:type="spellStart"/>
-      <w:r>
-        <w:t>OrderMaster</w:t>
-      </w:r>
-      <w:proofErr w:type="spellEnd"/>
     </w:p>
     <w:p>
       <w:pPr>
@@ -1646,6 +1555,46 @@
           <w:lang w:val="ru-RU"/>
         </w:rPr>
       </w:pPr>
+      <w:r>
+        <w:rPr>
+          <w:lang w:val="ru-RU"/>
+        </w:rPr>
+        <w:drawing>
+          <wp:inline distT="0" distB="0" distL="0" distR="0" wp14:anchorId="4A21E7E1" wp14:editId="12D768CB">
+            <wp:extent cx="5319712" cy="3722945"/>
+            <wp:effectExtent l="0" t="0" r="0" b="0"/>
+            <wp:docPr id="1508575904" name="Рисунок 1"/>
+            <wp:cNvGraphicFramePr>
+              <a:graphicFrameLocks xmlns:a="http://schemas.openxmlformats.org/drawingml/2006/main" noChangeAspect="1"/>
+            </wp:cNvGraphicFramePr>
+            <a:graphic xmlns:a="http://schemas.openxmlformats.org/drawingml/2006/main">
+              <a:graphicData uri="http://schemas.openxmlformats.org/drawingml/2006/picture">
+                <pic:pic xmlns:pic="http://schemas.openxmlformats.org/drawingml/2006/picture">
+                  <pic:nvPicPr>
+                    <pic:cNvPr id="1508575904" name=""/>
+                    <pic:cNvPicPr/>
+                  </pic:nvPicPr>
+                  <pic:blipFill>
+                    <a:blip r:embed="rId15"/>
+                    <a:stretch>
+                      <a:fillRect/>
+                    </a:stretch>
+                  </pic:blipFill>
+                  <pic:spPr>
+                    <a:xfrm>
+                      <a:off x="0" y="0"/>
+                      <a:ext cx="5325476" cy="3726979"/>
+                    </a:xfrm>
+                    <a:prstGeom prst="rect">
+                      <a:avLst/>
+                    </a:prstGeom>
+                  </pic:spPr>
+                </pic:pic>
+              </a:graphicData>
+            </a:graphic>
+          </wp:inline>
+        </w:drawing>
+      </w:r>
     </w:p>
     <w:p>
       <w:pPr>
@@ -1659,6 +1608,48 @@
           <w:lang w:val="ru-RU"/>
         </w:rPr>
       </w:pPr>
+      <w:r>
+        <w:rPr>
+          <w:lang w:val="ru-RU"/>
+        </w:rPr>
+        <w:t xml:space="preserve">Рисунок </w:t>
+      </w:r>
+      <w:r>
+        <w:rPr>
+          <w:lang w:val="ru-RU"/>
+        </w:rPr>
+        <w:t>2</w:t>
+      </w:r>
+      <w:r>
+        <w:rPr>
+          <w:lang w:val="ru-RU"/>
+        </w:rPr>
+        <w:t xml:space="preserve"> –</w:t>
+      </w:r>
+      <w:r>
+        <w:rPr>
+          <w:lang w:val="ru-RU"/>
+        </w:rPr>
+        <w:t xml:space="preserve"> </w:t>
+      </w:r>
+      <w:r>
+        <w:rPr>
+          <w:lang w:val="ru-RU"/>
+        </w:rPr>
+        <w:t>Вырождение системы вследствие поедания</w:t>
+      </w:r>
+      <w:r>
+        <w:rPr>
+          <w:lang w:val="ru-RU"/>
+        </w:rPr>
+        <w:br/>
+      </w:r>
+      <w:r>
+        <w:rPr>
+          <w:lang w:val="ru-RU"/>
+        </w:rPr>
+        <w:t>хищниками всех травоядных</w:t>
+      </w:r>
     </w:p>
     <w:p>
       <w:pPr>
@@ -1672,47 +1663,76 @@
           <w:lang w:val="ru-RU"/>
         </w:rPr>
       </w:pPr>
-      <w:r>
-        <w:rPr>
-          <w:lang w:val="ru-RU"/>
-        </w:rPr>
-        <w:t xml:space="preserve">Рисунок </w:t>
-      </w:r>
-      <w:r>
-        <w:rPr>
-          <w:lang w:val="ru-RU"/>
-        </w:rPr>
-        <w:t>3</w:t>
-      </w:r>
-      <w:r>
-        <w:rPr>
-          <w:lang w:val="ru-RU"/>
-        </w:rPr>
-        <w:t xml:space="preserve"> –</w:t>
-      </w:r>
-      <w:r>
-        <w:rPr>
-          <w:lang w:val="ru-RU"/>
-        </w:rPr>
-        <w:t xml:space="preserve"> Определение </w:t>
-      </w:r>
-      <w:r>
-        <w:rPr>
-          <w:lang w:val="ru-RU"/>
-        </w:rPr>
-        <w:t>функции, принимающей объекты</w:t>
-      </w:r>
-      <w:r>
-        <w:rPr>
-          <w:lang w:val="ru-RU"/>
-        </w:rPr>
-        <w:br/>
-      </w:r>
-      <w:r>
-        <w:rPr>
-          <w:lang w:val="ru-RU"/>
-        </w:rPr>
-        <w:t>в качестве аргументов</w:t>
+    </w:p>
+    <w:p>
+      <w:pPr>
+        <w:pStyle w:val="Standard"/>
+        <w:spacing w:after="0" w:line="360" w:lineRule="auto"/>
+        <w:jc w:val="center"/>
+        <w:rPr>
+          <w:rFonts w:ascii="Times New Roman" w:hAnsi="Times New Roman" w:cs="Times New Roman"/>
+          <w:b/>
+          <w:sz w:val="28"/>
+          <w:szCs w:val="28"/>
+        </w:rPr>
+      </w:pPr>
+      <w:r>
+        <w:rPr>
+          <w:rFonts w:ascii="Times New Roman" w:hAnsi="Times New Roman" w:cs="Times New Roman"/>
+          <w:b/>
+          <w:noProof/>
+          <w:sz w:val="28"/>
+          <w:szCs w:val="28"/>
+        </w:rPr>
+        <w:lastRenderedPageBreak/>
+        <w:drawing>
+          <wp:inline distT="0" distB="0" distL="0" distR="0" wp14:anchorId="75630028" wp14:editId="6CDBF262">
+            <wp:extent cx="5329237" cy="3738156"/>
+            <wp:effectExtent l="0" t="0" r="5080" b="0"/>
+            <wp:docPr id="380274885" name="Рисунок 1"/>
+            <wp:cNvGraphicFramePr>
+              <a:graphicFrameLocks xmlns:a="http://schemas.openxmlformats.org/drawingml/2006/main" noChangeAspect="1"/>
+            </wp:cNvGraphicFramePr>
+            <a:graphic xmlns:a="http://schemas.openxmlformats.org/drawingml/2006/main">
+              <a:graphicData uri="http://schemas.openxmlformats.org/drawingml/2006/picture">
+                <pic:pic xmlns:pic="http://schemas.openxmlformats.org/drawingml/2006/picture">
+                  <pic:nvPicPr>
+                    <pic:cNvPr id="0" name="Picture 1"/>
+                    <pic:cNvPicPr>
+                      <a:picLocks noChangeAspect="1" noChangeArrowheads="1"/>
+                    </pic:cNvPicPr>
+                  </pic:nvPicPr>
+                  <pic:blipFill>
+                    <a:blip r:embed="rId16" cstate="print">
+                      <a:extLst>
+                        <a:ext uri="{28A0092B-C50C-407E-A947-70E740481C1C}">
+                          <a14:useLocalDpi xmlns:a14="http://schemas.microsoft.com/office/drawing/2010/main" val="0"/>
+                        </a:ext>
+                      </a:extLst>
+                    </a:blip>
+                    <a:srcRect/>
+                    <a:stretch>
+                      <a:fillRect/>
+                    </a:stretch>
+                  </pic:blipFill>
+                  <pic:spPr bwMode="auto">
+                    <a:xfrm>
+                      <a:off x="0" y="0"/>
+                      <a:ext cx="5340377" cy="3745970"/>
+                    </a:xfrm>
+                    <a:prstGeom prst="rect">
+                      <a:avLst/>
+                    </a:prstGeom>
+                    <a:noFill/>
+                    <a:ln>
+                      <a:noFill/>
+                    </a:ln>
+                  </pic:spPr>
+                </pic:pic>
+              </a:graphicData>
+            </a:graphic>
+          </wp:inline>
+        </w:drawing>
       </w:r>
     </w:p>
     <w:p>
@@ -1727,19 +1747,31 @@
           <w:lang w:val="ru-RU"/>
         </w:rPr>
       </w:pPr>
-    </w:p>
-    <w:p>
-      <w:pPr>
-        <w:pStyle w:val="10"/>
-        <w:numPr>
-          <w:ilvl w:val="0"/>
-          <w:numId w:val="0"/>
-        </w:numPr>
-        <w:spacing w:after="0" w:line="360" w:lineRule="auto"/>
+      <w:r>
         <w:rPr>
           <w:lang w:val="ru-RU"/>
         </w:rPr>
-      </w:pPr>
+        <w:t xml:space="preserve">Рисунок </w:t>
+      </w:r>
+      <w:r>
+        <w:rPr>
+          <w:lang w:val="ru-RU"/>
+        </w:rPr>
+        <w:t>3</w:t>
+      </w:r>
+      <w:r>
+        <w:rPr>
+          <w:lang w:val="ru-RU"/>
+        </w:rPr>
+        <w:t xml:space="preserve"> – После подбора параметров система</w:t>
+      </w:r>
+      <w:r>
+        <w:rPr>
+          <w:lang w:val="ru-RU"/>
+        </w:rPr>
+        <w:br/>
+        <w:t>успешно доживает до 1000 шага</w:t>
+      </w:r>
     </w:p>
     <w:p>
       <w:pPr>
@@ -1753,30 +1785,6 @@
           <w:lang w:val="ru-RU"/>
         </w:rPr>
       </w:pPr>
-      <w:r>
-        <w:rPr>
-          <w:lang w:val="ru-RU"/>
-        </w:rPr>
-        <w:t xml:space="preserve">Рисунок </w:t>
-      </w:r>
-      <w:r>
-        <w:rPr>
-          <w:lang w:val="ru-RU"/>
-        </w:rPr>
-        <w:t>4</w:t>
-      </w:r>
-      <w:r>
-        <w:rPr>
-          <w:lang w:val="ru-RU"/>
-        </w:rPr>
-        <w:t xml:space="preserve"> – </w:t>
-      </w:r>
-      <w:r>
-        <w:rPr>
-          <w:lang w:val="ru-RU"/>
-        </w:rPr>
-        <w:t>Структура проекта</w:t>
-      </w:r>
     </w:p>
     <w:p>
       <w:pPr>
@@ -1885,18 +1893,8 @@
           <w:sz w:val="28"/>
           <w:szCs w:val="28"/>
         </w:rPr>
-        <w:t xml:space="preserve">Программа реализована сначала как консольное приложение, а затем переведена на </w:t>
-      </w:r>
-      <w:proofErr w:type="spellStart"/>
-      <w:r>
-        <w:rPr>
-          <w:rFonts w:ascii="Times New Roman" w:hAnsi="Times New Roman" w:cs="Times New Roman"/>
-          <w:sz w:val="28"/>
-          <w:szCs w:val="28"/>
-        </w:rPr>
-        <w:t>Swing</w:t>
-      </w:r>
-      <w:proofErr w:type="spellEnd"/>
+        <w:t>Программа реализована сначала как консольное приложение, а затем переведена на Swing</w:t>
+      </w:r>
       <w:r>
         <w:rPr>
           <w:rFonts w:ascii="Times New Roman" w:hAnsi="Times New Roman" w:cs="Times New Roman"/>
@@ -3872,6 +3870,7 @@
   <w:style w:type="character" w:default="1" w:styleId="a1">
     <w:name w:val="Default Paragraph Font"/>
     <w:uiPriority w:val="1"/>
+    <w:semiHidden/>
     <w:unhideWhenUsed/>
   </w:style>
   <w:style w:type="table" w:default="1" w:styleId="a2">

</xml_diff>

<commit_message>
modified report for lab1
</commit_message>
<xml_diff>
--- a/Java/lab1/lab1_report.docx
+++ b/Java/lab1/lab1_report.docx
@@ -222,9 +222,6 @@
         <w:pStyle w:val="Standard"/>
         <w:spacing w:after="0" w:line="240" w:lineRule="auto"/>
         <w:jc w:val="center"/>
-        <w:rPr>
-          <w:lang w:val="en-US"/>
-        </w:rPr>
       </w:pPr>
       <w:r>
         <w:rPr>
@@ -293,74 +290,63 @@
           <w:bCs/>
           <w:sz w:val="32"/>
           <w:szCs w:val="32"/>
+        </w:rPr>
+        <w:t>1</w:t>
+      </w:r>
+    </w:p>
+    <w:p>
+      <w:pPr>
+        <w:pStyle w:val="Standard"/>
+        <w:spacing w:after="0" w:line="360" w:lineRule="auto"/>
+        <w:rPr>
+          <w:rFonts w:ascii="Times New Roman" w:hAnsi="Times New Roman" w:cs="Times New Roman"/>
+          <w:sz w:val="28"/>
+          <w:szCs w:val="28"/>
+        </w:rPr>
+      </w:pPr>
+    </w:p>
+    <w:p>
+      <w:pPr>
+        <w:pStyle w:val="Standard"/>
+        <w:spacing w:after="0" w:line="360" w:lineRule="auto"/>
+        <w:rPr>
+          <w:rFonts w:ascii="Times New Roman" w:hAnsi="Times New Roman" w:cs="Times New Roman"/>
+          <w:sz w:val="28"/>
+          <w:szCs w:val="28"/>
+        </w:rPr>
+      </w:pPr>
+    </w:p>
+    <w:p>
+      <w:pPr>
+        <w:pStyle w:val="Standard"/>
+        <w:spacing w:after="0" w:line="360" w:lineRule="auto"/>
+        <w:rPr>
+          <w:rFonts w:ascii="Times New Roman" w:hAnsi="Times New Roman" w:cs="Times New Roman"/>
+          <w:sz w:val="28"/>
+          <w:szCs w:val="28"/>
+        </w:rPr>
+      </w:pPr>
+    </w:p>
+    <w:p>
+      <w:pPr>
+        <w:pStyle w:val="Standard"/>
+        <w:spacing w:after="0" w:line="360" w:lineRule="auto"/>
+        <w:rPr>
+          <w:rFonts w:ascii="Times New Roman" w:hAnsi="Times New Roman" w:cs="Times New Roman"/>
+          <w:sz w:val="28"/>
+          <w:szCs w:val="28"/>
+        </w:rPr>
+      </w:pPr>
+    </w:p>
+    <w:p>
+      <w:pPr>
+        <w:pStyle w:val="Standard"/>
+        <w:spacing w:after="0" w:line="360" w:lineRule="auto"/>
+        <w:rPr>
+          <w:rFonts w:ascii="Times New Roman" w:hAnsi="Times New Roman" w:cs="Times New Roman"/>
+          <w:sz w:val="28"/>
+          <w:szCs w:val="28"/>
           <w:lang w:val="en-US"/>
-        </w:rPr>
-        <w:t>1</w:t>
-      </w:r>
-    </w:p>
-    <w:p>
-      <w:pPr>
-        <w:pStyle w:val="Standard"/>
-        <w:spacing w:after="0" w:line="360" w:lineRule="auto"/>
-        <w:rPr>
-          <w:rFonts w:ascii="Times New Roman" w:hAnsi="Times New Roman" w:cs="Times New Roman"/>
-          <w:sz w:val="28"/>
-          <w:szCs w:val="28"/>
-        </w:rPr>
-      </w:pPr>
-    </w:p>
-    <w:p>
-      <w:pPr>
-        <w:pStyle w:val="Standard"/>
-        <w:spacing w:after="0" w:line="360" w:lineRule="auto"/>
-        <w:rPr>
-          <w:rFonts w:ascii="Times New Roman" w:hAnsi="Times New Roman" w:cs="Times New Roman"/>
-          <w:sz w:val="28"/>
-          <w:szCs w:val="28"/>
-        </w:rPr>
-      </w:pPr>
-    </w:p>
-    <w:p>
-      <w:pPr>
-        <w:pStyle w:val="Standard"/>
-        <w:spacing w:after="0" w:line="360" w:lineRule="auto"/>
-        <w:rPr>
-          <w:rFonts w:ascii="Times New Roman" w:hAnsi="Times New Roman" w:cs="Times New Roman"/>
-          <w:sz w:val="28"/>
-          <w:szCs w:val="28"/>
-        </w:rPr>
-      </w:pPr>
-    </w:p>
-    <w:p>
-      <w:pPr>
-        <w:pStyle w:val="Standard"/>
-        <w:spacing w:after="0" w:line="360" w:lineRule="auto"/>
-        <w:rPr>
-          <w:rFonts w:ascii="Times New Roman" w:hAnsi="Times New Roman" w:cs="Times New Roman"/>
-          <w:sz w:val="28"/>
-          <w:szCs w:val="28"/>
-        </w:rPr>
-      </w:pPr>
-    </w:p>
-    <w:p>
-      <w:pPr>
-        <w:pStyle w:val="Standard"/>
-        <w:spacing w:after="0" w:line="360" w:lineRule="auto"/>
-        <w:rPr>
-          <w:rFonts w:ascii="Times New Roman" w:hAnsi="Times New Roman" w:cs="Times New Roman"/>
-          <w:sz w:val="28"/>
-          <w:szCs w:val="28"/>
-        </w:rPr>
-      </w:pPr>
-    </w:p>
-    <w:p>
-      <w:pPr>
-        <w:pStyle w:val="Standard"/>
-        <w:spacing w:after="0" w:line="360" w:lineRule="auto"/>
-        <w:rPr>
-          <w:rFonts w:ascii="Times New Roman" w:hAnsi="Times New Roman" w:cs="Times New Roman"/>
-          <w:sz w:val="28"/>
-          <w:szCs w:val="28"/>
         </w:rPr>
       </w:pPr>
     </w:p>
@@ -511,6 +497,12 @@
         <w:pStyle w:val="Standard"/>
         <w:spacing w:after="0" w:line="360" w:lineRule="auto"/>
         <w:jc w:val="center"/>
+        <w:rPr>
+          <w:rFonts w:ascii="Times New Roman" w:hAnsi="Times New Roman" w:cs="Times New Roman"/>
+          <w:sz w:val="28"/>
+          <w:szCs w:val="28"/>
+          <w:lang w:val="en-US"/>
+        </w:rPr>
       </w:pPr>
       <w:r>
         <w:rPr>
@@ -520,15 +512,13 @@
         </w:rPr>
         <w:t>Санкт-Петербург</w:t>
       </w:r>
-      <w:r>
-        <w:rPr>
-          <w:rFonts w:ascii="Times New Roman" w:hAnsi="Times New Roman" w:cs="Times New Roman"/>
-          <w:sz w:val="28"/>
-          <w:szCs w:val="28"/>
-          <w:lang w:val="en-US"/>
-        </w:rPr>
-        <w:t xml:space="preserve"> </w:t>
-      </w:r>
+    </w:p>
+    <w:p>
+      <w:pPr>
+        <w:pStyle w:val="Standard"/>
+        <w:spacing w:after="0" w:line="360" w:lineRule="auto"/>
+        <w:jc w:val="center"/>
+      </w:pPr>
       <w:r>
         <w:rPr>
           <w:rFonts w:ascii="Times New Roman" w:hAnsi="Times New Roman" w:cs="Times New Roman"/>
@@ -1204,7 +1194,7 @@
           <w:noProof/>
         </w:rPr>
         <w:drawing>
-          <wp:inline distT="0" distB="0" distL="0" distR="0" wp14:anchorId="27262D12" wp14:editId="4CEE941C">
+          <wp:inline distT="0" distB="0" distL="0" distR="0" wp14:anchorId="27262D12" wp14:editId="6DDC8C4E">
             <wp:extent cx="5940425" cy="5913755"/>
             <wp:effectExtent l="0" t="0" r="3175" b="0"/>
             <wp:docPr id="1709773549" name="Рисунок 1"/>
@@ -1507,6 +1497,7 @@
       </w:pPr>
       <w:r>
         <w:rPr>
+          <w:noProof/>
           <w:lang w:val="ru-RU"/>
         </w:rPr>
         <w:drawing>
@@ -1623,6 +1614,7 @@
       </w:pPr>
       <w:r>
         <w:rPr>
+          <w:noProof/>
           <w:lang w:val="ru-RU"/>
         </w:rPr>
         <w:drawing>
@@ -1678,42 +1670,25 @@
         <w:rPr>
           <w:lang w:val="ru-RU"/>
         </w:rPr>
-        <w:t xml:space="preserve">Рисунок </w:t>
+        <w:t>Рисунок 2 –</w:t>
       </w:r>
       <w:r>
         <w:rPr>
           <w:lang w:val="ru-RU"/>
         </w:rPr>
-        <w:t>2</w:t>
+        <w:t xml:space="preserve"> </w:t>
       </w:r>
       <w:r>
         <w:rPr>
           <w:lang w:val="ru-RU"/>
         </w:rPr>
-        <w:t xml:space="preserve"> –</w:t>
+        <w:t>Вырождение системы вследствие поедания</w:t>
       </w:r>
       <w:r>
         <w:rPr>
           <w:lang w:val="ru-RU"/>
         </w:rPr>
-        <w:t xml:space="preserve"> </w:t>
-      </w:r>
-      <w:r>
-        <w:rPr>
-          <w:lang w:val="ru-RU"/>
-        </w:rPr>
-        <w:t>Вырождение системы вследствие поедания</w:t>
-      </w:r>
-      <w:r>
-        <w:rPr>
-          <w:lang w:val="ru-RU"/>
-        </w:rPr>
         <w:br/>
-      </w:r>
-      <w:r>
-        <w:rPr>
-          <w:lang w:val="ru-RU"/>
-        </w:rPr>
         <w:t>хищниками всех травоядных</w:t>
       </w:r>
     </w:p>
@@ -1752,7 +1727,7 @@
         </w:rPr>
         <w:lastRenderedPageBreak/>
         <w:drawing>
-          <wp:inline distT="0" distB="0" distL="0" distR="0" wp14:anchorId="75630028" wp14:editId="6CDBF262">
+          <wp:inline distT="0" distB="0" distL="0" distR="0" wp14:anchorId="75630028" wp14:editId="3138DF55">
             <wp:extent cx="5329237" cy="3738156"/>
             <wp:effectExtent l="0" t="0" r="5080" b="0"/>
             <wp:docPr id="380274885" name="Рисунок 1"/>
@@ -1817,19 +1792,7 @@
         <w:rPr>
           <w:lang w:val="ru-RU"/>
         </w:rPr>
-        <w:t xml:space="preserve">Рисунок </w:t>
-      </w:r>
-      <w:r>
-        <w:rPr>
-          <w:lang w:val="ru-RU"/>
-        </w:rPr>
-        <w:t>3</w:t>
-      </w:r>
-      <w:r>
-        <w:rPr>
-          <w:lang w:val="ru-RU"/>
-        </w:rPr>
-        <w:t xml:space="preserve"> – После подбора параметров система</w:t>
+        <w:t>Рисунок 3 – После подбора параметров система</w:t>
       </w:r>
       <w:r>
         <w:rPr>
@@ -1890,7 +1853,23 @@
           <w:sz w:val="28"/>
           <w:szCs w:val="28"/>
         </w:rPr>
-        <w:t>В ходе выполнения лабораторной работы была разработана программа «Искусственная жизнь», моделирующая простую пищевую цепочку из растений, травоядных и хищников на двумерном поле.</w:t>
+        <w:t xml:space="preserve">В ходе выполнения лабораторной работы была разработана программа, </w:t>
+      </w:r>
+      <w:r>
+        <w:rPr>
+          <w:rFonts w:ascii="Times New Roman" w:hAnsi="Times New Roman" w:cs="Times New Roman"/>
+          <w:sz w:val="28"/>
+          <w:szCs w:val="28"/>
+        </w:rPr>
+        <w:t xml:space="preserve">симулирующая </w:t>
+      </w:r>
+      <w:r>
+        <w:rPr>
+          <w:rFonts w:ascii="Times New Roman" w:hAnsi="Times New Roman" w:cs="Times New Roman"/>
+          <w:sz w:val="28"/>
+          <w:szCs w:val="28"/>
+        </w:rPr>
+        <w:t>простую пищевую цепочку из растений, травоядных и хищников на двумерном поле.</w:t>
       </w:r>
       <w:r>
         <w:rPr>

</xml_diff>